<commit_message>
Informação hamsters: secção @rgac alinhada com a versão canónica (Revisto 30-06-2026 18h00 Grupo)
Co-Authored-By: Claude Opus 5.5 <noreply@anthropic.com>
Claude-Session: https://claude.ai/code/session_01WqiSe3VTKUY3Xv1EtYwfBq
</commit_message>
<xml_diff>
--- a/Hamsters/Informacao_Criacao_Hamsters_Sirios.docx
+++ b/Hamsters/Informacao_Criacao_Hamsters_Sirios.docx
@@ -1799,7 +1799,7 @@
           <w:b w:val="0"/>
           <w:i w:val="0"/>
         </w:rPr>
-        <w:t>A al. dd) do n.º 1 do art.º 2.º do DL 276/2001 define «animal selvagem» de forma ampla («todo o animal cuja espécie existe na natureza…»). Nessa leitura, o hamster sírio poderia ficar abrangido pela proibição de anúncio e venda na Internet do art.º 55.º. Esta leitura é de afastar, por quatro razões: o próprio DL 276/2001 regula a criação de pequenos roedores como animais de companhia (art.º 26.º e anexo II); a espécie consta da parte B do anexo I do Reg. (UE) 2016/429; o ICNF, que é a autoridade para a fauna selvagem, não a trata como tal; e o @rgac define «animal de companhia» por remissão para esse anexo.</w:t>
+        <w:t>A al. dd) do n.º 1 do art.º 2.º do DL 276/2001 define «animal selvagem» de forma ampla («todo o animal cuja espécie existe na natureza…»). Nessa leitura, o hamster sírio poderia ficar abrangido pela proibição de anúncio e venda na Internet do art.º 55.º. Esta leitura é de afastar, por quatro razões: o próprio DL 276/2001 regula a criação de pequenos roedores como animais de companhia (art.º 26.º e anexo II); a espécie consta da parte B do anexo I do Reg. (UE) 2016/429; o ICNF, que é a autoridade para a fauna selvagem, não a trata como tal; e o @rgac inclui expressamente essas espécies (n.º 2 do art.º 2.º).</w:t>
       </w:r>
     </w:p>
     <w:p>
@@ -1821,7 +1821,53 @@
           <w:color w:val="555555"/>
           <w:sz w:val="18"/>
         </w:rPr>
-        <w:t>Versão analisada: RGAC_Rev. DAJA _V1_06_2026.</w:t>
+        <w:t>Versão analisada: diploma final @rgac (versão: RGAC_DAJA_REV. FORMAL_V1_Versão TRABALHO — Revisto 30-06-2026 18h00 Grupo). A leitura foi confirmada contra a versão RGAC_Rev. DAJA _V1_06_2026, que tem o mesmo conteúdo nesta matéria.</w:t>
+      </w:r>
+    </w:p>
+    <w:tbl>
+      <w:tblPr>
+        <w:tblStyle w:val="TableGrid"/>
+        <w:tblW w:type="auto" w:w="0"/>
+        <w:tblLook w:firstColumn="1" w:firstRow="1" w:lastColumn="0" w:lastRow="0" w:noHBand="0" w:noVBand="1" w:val="04A0"/>
+      </w:tblPr>
+      <w:tblGrid>
+        <w:gridCol w:w="9746"/>
+      </w:tblGrid>
+      <w:tr>
+        <w:tc>
+          <w:tcPr>
+            <w:tcW w:type="dxa" w:w="9746"/>
+            <w:shd w:val="clear" w:color="auto" w:fill="EEF3F8"/>
+          </w:tcPr>
+          <w:p>
+            <w:r>
+              <w:rPr>
+                <w:b/>
+                <w:color w:val="1F3A5F"/>
+                <w:sz w:val="18"/>
+              </w:rPr>
+              <w:t>n.º 2, do art.º 2.º do diploma final @rgac</w:t>
+            </w:r>
+          </w:p>
+          <w:p>
+            <w:r>
+              <w:rPr>
+                <w:i/>
+                <w:sz w:val="19"/>
+              </w:rPr>
+              <w:t>2 - Para efeitos do presente decreto-lei, são animais de companhia os animais das espécies constantes da Parte A do Anexo I do Regulamento (UE) 2016/429 do Parlamento Europeu e do Conselho, de 9 de março de 2016, e, quando detidos para fins de companhia, os das espécies constantes da Parte B do mesmo anexo.</w:t>
+            </w:r>
+          </w:p>
+        </w:tc>
+      </w:tr>
+    </w:tbl>
+    <w:p/>
+    <w:p>
+      <w:pPr>
+        <w:pStyle w:val="ListBullet"/>
+      </w:pPr>
+      <w:r>
+        <w:t>O hamster fica incluído de forma expressa (n.º 2 do art.º 2.º). A identificação obrigatória com registo no SIAC mantém-se só para cães, gatos e furões (n.º 1 do art.º 65.º).</w:t>
       </w:r>
     </w:p>
     <w:p>
@@ -1829,7 +1875,7 @@
         <w:pStyle w:val="ListBullet"/>
       </w:pPr>
       <w:r>
-        <w:t>Mantém a identificação obrigatória só para cães, gatos e furões. Define «animal de companhia» por remissão para o anexo I do Reg. (UE) 2016/429, o que inclui os roedores.</w:t>
+        <w:t>A dúvida da al. c) do n.º 1 do art.º 53.º do DL 276/2001 fica resolvida. No anúncio de «outros animais de companhia», o número de identificação só é exigido «quando aplicável» (n.º 4 do art.º 106.º). Na transmissão, estes animais devem ser acompanhados de «documento que ateste a origem, emitido pelo criador» (n.º 7 do art.º 105.º).</w:t>
       </w:r>
     </w:p>
     <w:p>
@@ -1837,7 +1883,7 @@
         <w:pStyle w:val="ListBullet"/>
       </w:pPr>
       <w:r>
-        <w:t>Resolve a dúvida da al. c) do n.º 1 do art.º 53.º. Para «outros animais de companhia», o anúncio deve conter o «Número de identificação da cria e da fêmea reprodutora, quando aplicável». Na transmissão, esses animais devem ser acompanhados de «documento que ateste a origem, emitido pelo criador».</w:t>
+        <w:t>Lacuna a corrigir: o anúncio de outras espécies exige o «N.º de registo do estabelecimento de criação» (n.º 4 do art.º 106.º). Porém, «Estabelecimento de criação» (art.º 3.º) está definido só para a instalação onde são mantidos «cães ou gatos». Assim, não fica claro se os criadores de roedores estão sujeitos a mera comunicação prévia (al. a) do n.º 1 do art.º 42.º). Sugere-se alargar a definição, ou prever expressamente os estabelecimentos de criação de outras espécies.</w:t>
       </w:r>
     </w:p>
     <w:p>
@@ -1845,7 +1891,7 @@
         <w:pStyle w:val="ListBullet"/>
       </w:pPr>
       <w:r>
-        <w:t>Lacuna a corrigir: o anúncio de outras espécies exige o «Número de registo do estabelecimento de criação». Porém, «Estabelecimento de criação» está definido só para instalações onde se mantêm «cães ou gatos». Assim, não fica claro se os criadores de roedores estão sujeitos a mera comunicação prévia. Sugere-se alargar a definição, ou prever expressamente os criadores de outras espécies.</w:t>
+        <w:t>O n.º 9 do art.º 2.º repete a exclusão das espécies da «fauna selvagem autóctone e exótica». Convém esclarecer que as espécies da parte B do anexo I do Reg. (UE) 2016/429 detidas para fins de companhia, como os roedores domesticados, não ficam abrangidas por essa exclusão.</w:t>
       </w:r>
     </w:p>
     <w:p>
@@ -1853,7 +1899,7 @@
         <w:pStyle w:val="ListBullet"/>
       </w:pPr>
       <w:r>
-        <w:t>Os parâmetros das caixas para pequenos roedores passam para portaria. Os parâmetros dos alojamentos de outras espécies passam para despacho do DG. Esta é a sede adequada para uma solução proporcional à pequena escala.</w:t>
+        <w:t>Os parâmetros das caixas para pequenos roedores passam para portaria (n.º 2 do art.º 35.º). Esta é a sede adequada para uma solução proporcional à pequena escala.</w:t>
       </w:r>
     </w:p>
     <w:p>
@@ -2184,7 +2230,7 @@
               <w:rPr>
                 <w:sz w:val="18"/>
               </w:rPr>
-              <w:t>@rgac: alargar a definição de «estabelecimento de criação» a outras espécies ou prever norma própria; prever um regime proporcional para a pequena escala (equivalência funcional das instalações do art.º 25.º), como no memorando sobre criação em pequena escala de 14.9.2026.</w:t>
+              <w:t>@rgac: alargar a definição de «estabelecimento de criação» (art.º 3.º) a outras espécies ou prever norma própria; clarificar o n.º 9 do art.º 2.º; prever um regime proporcional para a pequena escala (equivalência funcional das instalações do art.º 25.º), como no memorando sobre criação em pequena escala de 14.9.2026.</w:t>
             </w:r>
           </w:p>
         </w:tc>
@@ -2564,7 +2610,7 @@
         <w:pStyle w:val="ListBullet"/>
       </w:pPr>
       <w:r>
-        <w:t>Diploma final @rgac (versão: RGAC_Rev. DAJA _V1_06_2026) — trabalho em curso.</w:t>
+        <w:t>Diploma final @rgac (versão: RGAC_DAJA_REV. FORMAL_V1_Versão TRABALHO — Revisto 30-06-2026 18h00 Grupo) — trabalho em curso.</w:t>
       </w:r>
     </w:p>
     <w:sectPr>

</xml_diff>